<commit_message>
feat: update documentation, test files
</commit_message>
<xml_diff>
--- a/QscQsys/SIMPL/Qsys Core Help File.docx
+++ b/QscQsys/SIMPL/Qsys Core Help File.docx
@@ -282,25 +282,7 @@
                 <w:sz w:val="15"/>
                 <w:szCs w:val="24"/>
               </w:rPr>
-              <w:t>1</w:t>
-            </w:r>
-            <w:r>
-              <w:rPr>
-                <w:rFonts w:ascii="Verdana" w:hAnsi="Verdana"/>
-                <w:color w:val="000000"/>
-                <w:sz w:val="15"/>
-                <w:szCs w:val="24"/>
-              </w:rPr>
-              <w:t>.</w:t>
-            </w:r>
-            <w:r>
-              <w:rPr>
-                <w:rFonts w:ascii="Verdana" w:hAnsi="Verdana"/>
-                <w:color w:val="000000"/>
-                <w:sz w:val="15"/>
-                <w:szCs w:val="24"/>
-              </w:rPr>
-              <w:t>2</w:t>
+              <w:t>3.0</w:t>
             </w:r>
           </w:p>
         </w:tc>
@@ -889,7 +871,7 @@
                 <w:sz w:val="16"/>
                 <w:szCs w:val="24"/>
               </w:rPr>
-              <w:t>DeploymentHost</w:t>
+              <w:t>PrimaryCoreIpAddress</w:t>
             </w:r>
             <w:proofErr w:type="spellEnd"/>
             <w:r>
@@ -909,7 +891,7 @@
                 <w:sz w:val="16"/>
                 <w:szCs w:val="24"/>
               </w:rPr>
-              <w:t>TestingHost</w:t>
+              <w:t>BackupCoreIpAddress</w:t>
             </w:r>
             <w:proofErr w:type="spellEnd"/>
             <w:r>
@@ -921,17 +903,15 @@
               </w:rPr>
               <w:t xml:space="preserve">, </w:t>
             </w:r>
-            <w:proofErr w:type="spellStart"/>
-            <w:r>
-              <w:rPr>
-                <w:rFonts w:ascii="Arial" w:hAnsi="Arial" w:cs="Arial"/>
-                <w:color w:val="000000"/>
-                <w:sz w:val="16"/>
-                <w:szCs w:val="24"/>
-              </w:rPr>
-              <w:t>DeploymentMode</w:t>
-            </w:r>
-            <w:proofErr w:type="spellEnd"/>
+            <w:r>
+              <w:rPr>
+                <w:rFonts w:ascii="Arial" w:hAnsi="Arial" w:cs="Arial"/>
+                <w:color w:val="000000"/>
+                <w:sz w:val="16"/>
+                <w:szCs w:val="24"/>
+              </w:rPr>
+              <w:t>Port</w:t>
+            </w:r>
             <w:r>
               <w:rPr>
                 <w:rFonts w:ascii="Arial" w:hAnsi="Arial" w:cs="Arial"/>
@@ -982,6 +962,16 @@
                 <w:szCs w:val="16"/>
               </w:rPr>
             </w:pPr>
+            <w:r>
+              <w:rPr>
+                <w:rFonts w:ascii="Arial" w:hAnsi="Arial" w:cs="Arial"/>
+                <w:b/>
+                <w:bCs/>
+                <w:sz w:val="16"/>
+                <w:szCs w:val="16"/>
+              </w:rPr>
+              <w:t>[</w:t>
+            </w:r>
             <w:proofErr w:type="spellStart"/>
             <w:r>
               <w:rPr>
@@ -991,9 +981,19 @@
                 <w:sz w:val="16"/>
                 <w:szCs w:val="16"/>
               </w:rPr>
-              <w:t>DeploymentHost</w:t>
+              <w:t>PrimaryCoreIpAddress</w:t>
             </w:r>
             <w:proofErr w:type="spellEnd"/>
+            <w:r>
+              <w:rPr>
+                <w:rFonts w:ascii="Arial" w:hAnsi="Arial" w:cs="Arial"/>
+                <w:b/>
+                <w:bCs/>
+                <w:sz w:val="16"/>
+                <w:szCs w:val="16"/>
+              </w:rPr>
+              <w:t>]</w:t>
+            </w:r>
           </w:p>
         </w:tc>
         <w:tc>
@@ -1043,45 +1043,16 @@
                 <w:sz w:val="16"/>
                 <w:szCs w:val="24"/>
               </w:rPr>
-              <w:t xml:space="preserve">IP Address or Hostname of the Q-SYS Core to connect to for Deployment. This value will be used when </w:t>
-            </w:r>
-            <w:proofErr w:type="spellStart"/>
-            <w:r>
-              <w:rPr>
-                <w:rFonts w:ascii="Arial" w:hAnsi="Arial" w:cs="Arial"/>
-                <w:color w:val="000000"/>
-                <w:sz w:val="16"/>
-                <w:szCs w:val="24"/>
-              </w:rPr>
-              <w:t>DeploymentMode</w:t>
-            </w:r>
-            <w:proofErr w:type="spellEnd"/>
-            <w:r>
-              <w:rPr>
-                <w:rFonts w:ascii="Arial" w:hAnsi="Arial" w:cs="Arial"/>
-                <w:color w:val="000000"/>
-                <w:sz w:val="16"/>
-                <w:szCs w:val="24"/>
-              </w:rPr>
-              <w:t xml:space="preserve"> is </w:t>
-            </w:r>
-            <w:r>
-              <w:rPr>
-                <w:rFonts w:ascii="Arial" w:hAnsi="Arial" w:cs="Arial"/>
-                <w:color w:val="000000"/>
-                <w:sz w:val="16"/>
-                <w:szCs w:val="24"/>
-              </w:rPr>
-              <w:t>1</w:t>
-            </w:r>
-            <w:r>
-              <w:rPr>
-                <w:rFonts w:ascii="Arial" w:hAnsi="Arial" w:cs="Arial"/>
-                <w:color w:val="000000"/>
-                <w:sz w:val="16"/>
-                <w:szCs w:val="24"/>
-              </w:rPr>
-              <w:t>.</w:t>
+              <w:t xml:space="preserve">Optional. </w:t>
+            </w:r>
+            <w:r>
+              <w:rPr>
+                <w:rFonts w:ascii="Arial" w:hAnsi="Arial" w:cs="Arial"/>
+                <w:color w:val="000000"/>
+                <w:sz w:val="16"/>
+                <w:szCs w:val="24"/>
+              </w:rPr>
+              <w:t>IP Address or Hostname of the Q-SYS Core to connect to for Deployment.</w:t>
             </w:r>
           </w:p>
         </w:tc>
@@ -1123,7 +1094,17 @@
                 <w:sz w:val="16"/>
                 <w:szCs w:val="16"/>
               </w:rPr>
-              <w:t>TestingHost</w:t>
+              <w:t>Backup</w:t>
+            </w:r>
+            <w:r>
+              <w:rPr>
+                <w:rFonts w:ascii="Arial" w:hAnsi="Arial" w:cs="Arial"/>
+                <w:b/>
+                <w:bCs/>
+                <w:sz w:val="16"/>
+                <w:szCs w:val="16"/>
+              </w:rPr>
+              <w:t>CoreIpAddress</w:t>
             </w:r>
             <w:proofErr w:type="spellEnd"/>
             <w:r>
@@ -1185,45 +1166,25 @@
                 <w:sz w:val="16"/>
                 <w:szCs w:val="24"/>
               </w:rPr>
-              <w:t xml:space="preserve">IP Address or Hostname of the Q-SYS Core to connect to for Testing. This value will be used when </w:t>
-            </w:r>
-            <w:proofErr w:type="spellStart"/>
-            <w:r>
-              <w:rPr>
-                <w:rFonts w:ascii="Arial" w:hAnsi="Arial" w:cs="Arial"/>
-                <w:color w:val="000000"/>
-                <w:sz w:val="16"/>
-                <w:szCs w:val="24"/>
-              </w:rPr>
-              <w:t>DeploymentMode</w:t>
-            </w:r>
-            <w:proofErr w:type="spellEnd"/>
-            <w:r>
-              <w:rPr>
-                <w:rFonts w:ascii="Arial" w:hAnsi="Arial" w:cs="Arial"/>
-                <w:color w:val="000000"/>
-                <w:sz w:val="16"/>
-                <w:szCs w:val="24"/>
-              </w:rPr>
-              <w:t xml:space="preserve"> is </w:t>
-            </w:r>
-            <w:r>
-              <w:rPr>
-                <w:rFonts w:ascii="Arial" w:hAnsi="Arial" w:cs="Arial"/>
-                <w:color w:val="000000"/>
-                <w:sz w:val="16"/>
-                <w:szCs w:val="24"/>
-              </w:rPr>
-              <w:t>0</w:t>
-            </w:r>
-            <w:r>
-              <w:rPr>
-                <w:rFonts w:ascii="Arial" w:hAnsi="Arial" w:cs="Arial"/>
-                <w:color w:val="000000"/>
-                <w:sz w:val="16"/>
-                <w:szCs w:val="24"/>
-              </w:rPr>
-              <w:t>.</w:t>
+              <w:t xml:space="preserve">Optional. </w:t>
+            </w:r>
+            <w:r>
+              <w:rPr>
+                <w:rFonts w:ascii="Arial" w:hAnsi="Arial" w:cs="Arial"/>
+                <w:color w:val="000000"/>
+                <w:sz w:val="16"/>
+                <w:szCs w:val="24"/>
+              </w:rPr>
+              <w:t xml:space="preserve">IP Address or Hostname of the </w:t>
+            </w:r>
+            <w:r>
+              <w:rPr>
+                <w:rFonts w:ascii="Arial" w:hAnsi="Arial" w:cs="Arial"/>
+                <w:color w:val="000000"/>
+                <w:sz w:val="16"/>
+                <w:szCs w:val="24"/>
+              </w:rPr>
+              <w:t>redundant/backup Q-SYS Core in your design.</w:t>
             </w:r>
           </w:p>
         </w:tc>
@@ -1246,18 +1207,16 @@
                 <w:szCs w:val="16"/>
               </w:rPr>
             </w:pPr>
-            <w:proofErr w:type="spellStart"/>
-            <w:r>
-              <w:rPr>
-                <w:rFonts w:ascii="Arial" w:hAnsi="Arial" w:cs="Arial"/>
-                <w:b/>
-                <w:bCs/>
-                <w:sz w:val="16"/>
-                <w:szCs w:val="16"/>
-              </w:rPr>
-              <w:t>DeploymentMode</w:t>
-            </w:r>
-            <w:proofErr w:type="spellEnd"/>
+            <w:r>
+              <w:rPr>
+                <w:rFonts w:ascii="Arial" w:hAnsi="Arial" w:cs="Arial"/>
+                <w:b/>
+                <w:bCs/>
+                <w:sz w:val="16"/>
+                <w:szCs w:val="16"/>
+              </w:rPr>
+              <w:t>[Port]</w:t>
+            </w:r>
           </w:p>
           <w:p>
             <w:pPr>
@@ -1317,108 +1276,8 @@
                 <w:sz w:val="16"/>
                 <w:szCs w:val="24"/>
               </w:rPr>
-              <w:t xml:space="preserve">Specifies whether to use </w:t>
-            </w:r>
-            <w:proofErr w:type="spellStart"/>
-            <w:r>
-              <w:rPr>
-                <w:rFonts w:ascii="Arial" w:hAnsi="Arial" w:cs="Arial"/>
-                <w:color w:val="000000"/>
-                <w:sz w:val="16"/>
-                <w:szCs w:val="24"/>
-              </w:rPr>
-              <w:t>DeploymentHost</w:t>
-            </w:r>
-            <w:proofErr w:type="spellEnd"/>
-            <w:r>
-              <w:rPr>
-                <w:rFonts w:ascii="Arial" w:hAnsi="Arial" w:cs="Arial"/>
-                <w:color w:val="000000"/>
-                <w:sz w:val="16"/>
-                <w:szCs w:val="24"/>
-              </w:rPr>
-              <w:t xml:space="preserve"> or Testing Host. </w:t>
-            </w:r>
-          </w:p>
-          <w:p>
-            <w:pPr>
-              <w:spacing w:before="100" w:after="100"/>
-              <w:rPr>
-                <w:rFonts w:ascii="Arial" w:hAnsi="Arial" w:cs="Arial"/>
-                <w:color w:val="000000"/>
-                <w:sz w:val="16"/>
-                <w:szCs w:val="24"/>
-              </w:rPr>
-            </w:pPr>
-            <w:r>
-              <w:rPr>
-                <w:rFonts w:ascii="Arial" w:hAnsi="Arial" w:cs="Arial"/>
-                <w:color w:val="000000"/>
-                <w:sz w:val="16"/>
-                <w:szCs w:val="24"/>
-              </w:rPr>
-              <w:t>1</w:t>
-            </w:r>
-            <w:r>
-              <w:rPr>
-                <w:rFonts w:ascii="Arial" w:hAnsi="Arial" w:cs="Arial"/>
-                <w:color w:val="000000"/>
-                <w:sz w:val="16"/>
-                <w:szCs w:val="24"/>
-              </w:rPr>
-              <w:t xml:space="preserve">: </w:t>
-            </w:r>
-            <w:proofErr w:type="spellStart"/>
-            <w:r>
-              <w:rPr>
-                <w:rFonts w:ascii="Arial" w:hAnsi="Arial" w:cs="Arial"/>
-                <w:color w:val="000000"/>
-                <w:sz w:val="16"/>
-                <w:szCs w:val="24"/>
-              </w:rPr>
-              <w:t>DeploymentHost</w:t>
-            </w:r>
-            <w:proofErr w:type="spellEnd"/>
-          </w:p>
-          <w:p>
-            <w:pPr>
-              <w:spacing w:before="100" w:after="100"/>
-              <w:rPr>
-                <w:rFonts w:ascii="Arial" w:hAnsi="Arial" w:cs="Arial"/>
-                <w:color w:val="000000"/>
-                <w:sz w:val="16"/>
-                <w:szCs w:val="24"/>
-              </w:rPr>
-            </w:pPr>
-            <w:r>
-              <w:rPr>
-                <w:rFonts w:ascii="Arial" w:hAnsi="Arial" w:cs="Arial"/>
-                <w:color w:val="000000"/>
-                <w:sz w:val="16"/>
-                <w:szCs w:val="24"/>
-              </w:rPr>
-              <w:t>0</w:t>
-            </w:r>
-            <w:r>
-              <w:rPr>
-                <w:rFonts w:ascii="Arial" w:hAnsi="Arial" w:cs="Arial"/>
-                <w:color w:val="000000"/>
-                <w:sz w:val="16"/>
-                <w:szCs w:val="24"/>
-              </w:rPr>
-              <w:t xml:space="preserve">: </w:t>
-            </w:r>
-            <w:proofErr w:type="spellStart"/>
-            <w:r>
-              <w:rPr>
-                <w:rFonts w:ascii="Arial" w:hAnsi="Arial" w:cs="Arial"/>
-                <w:color w:val="000000"/>
-                <w:sz w:val="16"/>
-                <w:szCs w:val="24"/>
-              </w:rPr>
-              <w:t>TestingHost</w:t>
-            </w:r>
-            <w:proofErr w:type="spellEnd"/>
+              <w:t>Optional. TCP Port to use for connection if different from the default: 1710.</w:t>
+            </w:r>
           </w:p>
         </w:tc>
       </w:tr>
@@ -1860,6 +1719,13 @@
         </w:tc>
       </w:tr>
     </w:tbl>
+    <w:p>
+      <w:pPr>
+        <w:rPr>
+          <w:sz w:val="20"/>
+        </w:rPr>
+      </w:pPr>
+    </w:p>
     <w:p>
       <w:pPr>
         <w:rPr>
@@ -1927,6 +1793,7 @@
               <w:rPr>
                 <w:rFonts w:ascii="Arial" w:hAnsi="Arial" w:cs="Arial"/>
               </w:rPr>
+              <w:lastRenderedPageBreak/>
               <w:br w:type="page"/>
             </w:r>
             <w:r>
@@ -2103,7 +1970,7 @@
                 <w:sz w:val="16"/>
                 <w:szCs w:val="16"/>
               </w:rPr>
-              <w:t>IsConnected</w:t>
+              <w:t>PrimaryCoreIsConnected</w:t>
             </w:r>
             <w:proofErr w:type="spellEnd"/>
             <w:r>
@@ -2168,7 +2035,34 @@
                 <w:sz w:val="16"/>
                 <w:szCs w:val="24"/>
               </w:rPr>
-              <w:t>Signal used to show if the Q-SYS Core is communicating.</w:t>
+              <w:t xml:space="preserve">Signal used to show if the </w:t>
+            </w:r>
+            <w:r>
+              <w:rPr>
+                <w:rFonts w:ascii="Arial" w:hAnsi="Arial" w:cs="Arial"/>
+                <w:color w:val="000000"/>
+                <w:sz w:val="16"/>
+                <w:szCs w:val="24"/>
+              </w:rPr>
+              <w:t xml:space="preserve">Primary </w:t>
+            </w:r>
+            <w:r>
+              <w:rPr>
+                <w:rFonts w:ascii="Arial" w:hAnsi="Arial" w:cs="Arial"/>
+                <w:color w:val="000000"/>
+                <w:sz w:val="16"/>
+                <w:szCs w:val="24"/>
+              </w:rPr>
+              <w:t xml:space="preserve">Q-SYS Core </w:t>
+            </w:r>
+            <w:r>
+              <w:rPr>
+                <w:rFonts w:ascii="Arial" w:hAnsi="Arial" w:cs="Arial"/>
+                <w:color w:val="000000"/>
+                <w:sz w:val="16"/>
+                <w:szCs w:val="24"/>
+              </w:rPr>
+              <w:t>is connected.</w:t>
             </w:r>
           </w:p>
         </w:tc>
@@ -2210,7 +2104,17 @@
                 <w:sz w:val="16"/>
                 <w:szCs w:val="16"/>
               </w:rPr>
-              <w:t>IsLoggedIn</w:t>
+              <w:t>Backup</w:t>
+            </w:r>
+            <w:r>
+              <w:rPr>
+                <w:rFonts w:ascii="Arial" w:hAnsi="Arial" w:cs="Arial"/>
+                <w:b/>
+                <w:bCs/>
+                <w:sz w:val="16"/>
+                <w:szCs w:val="16"/>
+              </w:rPr>
+              <w:t>CoreIsConnected</w:t>
             </w:r>
             <w:proofErr w:type="spellEnd"/>
             <w:r>
@@ -2258,7 +2162,7 @@
           <w:p>
             <w:pPr>
               <w:tabs>
-                <w:tab w:val="left" w:pos="4776"/>
+                <w:tab w:val="right" w:pos="5910"/>
               </w:tabs>
               <w:spacing w:before="100" w:after="100"/>
               <w:rPr>
@@ -2275,7 +2179,7 @@
                 <w:sz w:val="16"/>
                 <w:szCs w:val="24"/>
               </w:rPr>
-              <w:t>Signal used to show if this module is logged in with the Q-SYS Core.</w:t>
+              <w:t>Signal used to show if the Backup Q-SYS Core is connected.</w:t>
             </w:r>
           </w:p>
         </w:tc>
@@ -2317,7 +2221,7 @@
                 <w:sz w:val="16"/>
                 <w:szCs w:val="16"/>
               </w:rPr>
-              <w:t>IsRedundant</w:t>
+              <w:t>PrimaryCoreIsActive</w:t>
             </w:r>
             <w:proofErr w:type="spellEnd"/>
             <w:r>
@@ -2364,6 +2268,9 @@
           </w:tcPr>
           <w:p>
             <w:pPr>
+              <w:tabs>
+                <w:tab w:val="right" w:pos="5910"/>
+              </w:tabs>
               <w:spacing w:before="100" w:after="100"/>
               <w:rPr>
                 <w:rFonts w:ascii="Arial" w:hAnsi="Arial" w:cs="Arial"/>
@@ -2379,7 +2286,7 @@
                 <w:sz w:val="16"/>
                 <w:szCs w:val="24"/>
               </w:rPr>
-              <w:t>Signal used to show if the Q-SYS Core is redundant.</w:t>
+              <w:t>Signal used to show if the Primary Q-SYS Core is the one currently running.</w:t>
             </w:r>
           </w:p>
         </w:tc>
@@ -2396,6 +2303,8 @@
             <w:pPr>
               <w:rPr>
                 <w:rFonts w:ascii="Arial" w:hAnsi="Arial" w:cs="Arial"/>
+                <w:b/>
+                <w:bCs/>
                 <w:sz w:val="16"/>
                 <w:szCs w:val="16"/>
               </w:rPr>
@@ -2419,7 +2328,7 @@
                 <w:sz w:val="16"/>
                 <w:szCs w:val="16"/>
               </w:rPr>
-              <w:t>IsEmulator</w:t>
+              <w:t>BackupCoreIsActive</w:t>
             </w:r>
             <w:proofErr w:type="spellEnd"/>
             <w:r>
@@ -2466,6 +2375,9 @@
           </w:tcPr>
           <w:p>
             <w:pPr>
+              <w:tabs>
+                <w:tab w:val="right" w:pos="5910"/>
+              </w:tabs>
               <w:spacing w:before="100" w:after="100"/>
               <w:rPr>
                 <w:rFonts w:ascii="Arial" w:hAnsi="Arial" w:cs="Arial"/>
@@ -2481,7 +2393,7 @@
                 <w:sz w:val="16"/>
                 <w:szCs w:val="24"/>
               </w:rPr>
-              <w:t>Signal used to show if the Q-SYS Core is connected to an emulated file.</w:t>
+              <w:t>Signal used to show if the Backup Q-SYS Core is the one currently running.</w:t>
             </w:r>
           </w:p>
         </w:tc>
@@ -2523,7 +2435,7 @@
                 <w:sz w:val="16"/>
                 <w:szCs w:val="16"/>
               </w:rPr>
-              <w:t>DesignName</w:t>
+              <w:t>IsLoggedIn</w:t>
             </w:r>
             <w:proofErr w:type="spellEnd"/>
             <w:r>
@@ -2560,7 +2472,7 @@
                 <w:sz w:val="16"/>
                 <w:szCs w:val="24"/>
               </w:rPr>
-              <w:t>S</w:t>
+              <w:t>D</w:t>
             </w:r>
           </w:p>
         </w:tc>
@@ -2570,6 +2482,9 @@
           </w:tcPr>
           <w:p>
             <w:pPr>
+              <w:tabs>
+                <w:tab w:val="left" w:pos="4776"/>
+              </w:tabs>
               <w:spacing w:before="100" w:after="100"/>
               <w:rPr>
                 <w:rFonts w:ascii="Arial" w:hAnsi="Arial" w:cs="Arial"/>
@@ -2585,7 +2500,7 @@
                 <w:sz w:val="16"/>
                 <w:szCs w:val="24"/>
               </w:rPr>
-              <w:t>Signal used to show the current running design on the Q-SYS Core.</w:t>
+              <w:t>Signal used to show if this module is logged in with the Q-SYS Core.</w:t>
             </w:r>
           </w:p>
         </w:tc>
@@ -2593,6 +2508,316 @@
       <w:tr>
         <w:trPr>
           <w:cnfStyle w:val="000000010000" w:firstRow="0" w:lastRow="0" w:firstColumn="0" w:lastColumn="0" w:oddVBand="0" w:evenVBand="0" w:oddHBand="0" w:evenHBand="1" w:firstRowFirstColumn="0" w:firstRowLastColumn="0" w:lastRowFirstColumn="0" w:lastRowLastColumn="0"/>
+        </w:trPr>
+        <w:tc>
+          <w:tcPr>
+            <w:tcW w:w="3403" w:type="dxa"/>
+          </w:tcPr>
+          <w:p>
+            <w:pPr>
+              <w:rPr>
+                <w:rFonts w:ascii="Arial" w:hAnsi="Arial" w:cs="Arial"/>
+                <w:b/>
+                <w:bCs/>
+                <w:sz w:val="16"/>
+                <w:szCs w:val="16"/>
+              </w:rPr>
+            </w:pPr>
+            <w:r>
+              <w:rPr>
+                <w:rFonts w:ascii="Arial" w:hAnsi="Arial" w:cs="Arial"/>
+                <w:b/>
+                <w:bCs/>
+                <w:sz w:val="16"/>
+                <w:szCs w:val="16"/>
+              </w:rPr>
+              <w:t>[</w:t>
+            </w:r>
+            <w:proofErr w:type="spellStart"/>
+            <w:r>
+              <w:rPr>
+                <w:rFonts w:ascii="Arial" w:hAnsi="Arial" w:cs="Arial"/>
+                <w:b/>
+                <w:bCs/>
+                <w:sz w:val="16"/>
+                <w:szCs w:val="16"/>
+              </w:rPr>
+              <w:t>IsRedundant</w:t>
+            </w:r>
+            <w:proofErr w:type="spellEnd"/>
+            <w:r>
+              <w:rPr>
+                <w:rFonts w:ascii="Arial" w:hAnsi="Arial" w:cs="Arial"/>
+                <w:b/>
+                <w:bCs/>
+                <w:sz w:val="16"/>
+                <w:szCs w:val="16"/>
+              </w:rPr>
+              <w:t>]</w:t>
+            </w:r>
+          </w:p>
+        </w:tc>
+        <w:tc>
+          <w:tcPr>
+            <w:tcW w:w="379" w:type="dxa"/>
+          </w:tcPr>
+          <w:p>
+            <w:pPr>
+              <w:spacing w:before="100" w:after="100"/>
+              <w:jc w:val="center"/>
+              <w:rPr>
+                <w:rFonts w:ascii="Arial" w:hAnsi="Arial" w:cs="Arial"/>
+                <w:color w:val="000000"/>
+                <w:sz w:val="16"/>
+                <w:szCs w:val="24"/>
+              </w:rPr>
+            </w:pPr>
+            <w:r>
+              <w:rPr>
+                <w:rFonts w:ascii="Arial" w:hAnsi="Arial" w:cs="Arial"/>
+                <w:color w:val="000000"/>
+                <w:sz w:val="16"/>
+                <w:szCs w:val="24"/>
+              </w:rPr>
+              <w:t>D</w:t>
+            </w:r>
+          </w:p>
+        </w:tc>
+        <w:tc>
+          <w:tcPr>
+            <w:tcW w:w="6126" w:type="dxa"/>
+          </w:tcPr>
+          <w:p>
+            <w:pPr>
+              <w:spacing w:before="100" w:after="100"/>
+              <w:rPr>
+                <w:rFonts w:ascii="Arial" w:hAnsi="Arial" w:cs="Arial"/>
+                <w:color w:val="000000"/>
+                <w:sz w:val="16"/>
+                <w:szCs w:val="24"/>
+              </w:rPr>
+            </w:pPr>
+            <w:r>
+              <w:rPr>
+                <w:rFonts w:ascii="Arial" w:hAnsi="Arial" w:cs="Arial"/>
+                <w:color w:val="000000"/>
+                <w:sz w:val="16"/>
+                <w:szCs w:val="24"/>
+              </w:rPr>
+              <w:t>Signal used to show if the Q-SYS Core is redundant.</w:t>
+            </w:r>
+          </w:p>
+        </w:tc>
+      </w:tr>
+      <w:tr>
+        <w:trPr>
+          <w:cnfStyle w:val="000000100000" w:firstRow="0" w:lastRow="0" w:firstColumn="0" w:lastColumn="0" w:oddVBand="0" w:evenVBand="0" w:oddHBand="1" w:evenHBand="0" w:firstRowFirstColumn="0" w:firstRowLastColumn="0" w:lastRowFirstColumn="0" w:lastRowLastColumn="0"/>
+        </w:trPr>
+        <w:tc>
+          <w:tcPr>
+            <w:tcW w:w="3403" w:type="dxa"/>
+          </w:tcPr>
+          <w:p>
+            <w:pPr>
+              <w:rPr>
+                <w:rFonts w:ascii="Arial" w:hAnsi="Arial" w:cs="Arial"/>
+                <w:sz w:val="16"/>
+                <w:szCs w:val="16"/>
+              </w:rPr>
+            </w:pPr>
+            <w:r>
+              <w:rPr>
+                <w:rFonts w:ascii="Arial" w:hAnsi="Arial" w:cs="Arial"/>
+                <w:b/>
+                <w:bCs/>
+                <w:sz w:val="16"/>
+                <w:szCs w:val="16"/>
+              </w:rPr>
+              <w:t>[</w:t>
+            </w:r>
+            <w:proofErr w:type="spellStart"/>
+            <w:r>
+              <w:rPr>
+                <w:rFonts w:ascii="Arial" w:hAnsi="Arial" w:cs="Arial"/>
+                <w:b/>
+                <w:bCs/>
+                <w:sz w:val="16"/>
+                <w:szCs w:val="16"/>
+              </w:rPr>
+              <w:t>IsEmulator</w:t>
+            </w:r>
+            <w:proofErr w:type="spellEnd"/>
+            <w:r>
+              <w:rPr>
+                <w:rFonts w:ascii="Arial" w:hAnsi="Arial" w:cs="Arial"/>
+                <w:b/>
+                <w:bCs/>
+                <w:sz w:val="16"/>
+                <w:szCs w:val="16"/>
+              </w:rPr>
+              <w:t>]</w:t>
+            </w:r>
+          </w:p>
+        </w:tc>
+        <w:tc>
+          <w:tcPr>
+            <w:tcW w:w="379" w:type="dxa"/>
+          </w:tcPr>
+          <w:p>
+            <w:pPr>
+              <w:spacing w:before="100" w:after="100"/>
+              <w:jc w:val="center"/>
+              <w:rPr>
+                <w:rFonts w:ascii="Arial" w:hAnsi="Arial" w:cs="Arial"/>
+                <w:color w:val="000000"/>
+                <w:sz w:val="16"/>
+                <w:szCs w:val="24"/>
+              </w:rPr>
+            </w:pPr>
+            <w:r>
+              <w:rPr>
+                <w:rFonts w:ascii="Arial" w:hAnsi="Arial" w:cs="Arial"/>
+                <w:color w:val="000000"/>
+                <w:sz w:val="16"/>
+                <w:szCs w:val="24"/>
+              </w:rPr>
+              <w:t>D</w:t>
+            </w:r>
+          </w:p>
+        </w:tc>
+        <w:tc>
+          <w:tcPr>
+            <w:tcW w:w="6126" w:type="dxa"/>
+          </w:tcPr>
+          <w:p>
+            <w:pPr>
+              <w:spacing w:before="100" w:after="100"/>
+              <w:rPr>
+                <w:rFonts w:ascii="Arial" w:hAnsi="Arial" w:cs="Arial"/>
+                <w:color w:val="000000"/>
+                <w:sz w:val="16"/>
+                <w:szCs w:val="24"/>
+              </w:rPr>
+            </w:pPr>
+            <w:r>
+              <w:rPr>
+                <w:rFonts w:ascii="Arial" w:hAnsi="Arial" w:cs="Arial"/>
+                <w:color w:val="000000"/>
+                <w:sz w:val="16"/>
+                <w:szCs w:val="24"/>
+              </w:rPr>
+              <w:t>Signal used to show if the Q-SYS Core is connected to an emulated file.</w:t>
+            </w:r>
+          </w:p>
+        </w:tc>
+      </w:tr>
+      <w:tr>
+        <w:trPr>
+          <w:cnfStyle w:val="000000010000" w:firstRow="0" w:lastRow="0" w:firstColumn="0" w:lastColumn="0" w:oddVBand="0" w:evenVBand="0" w:oddHBand="0" w:evenHBand="1" w:firstRowFirstColumn="0" w:firstRowLastColumn="0" w:lastRowFirstColumn="0" w:lastRowLastColumn="0"/>
+        </w:trPr>
+        <w:tc>
+          <w:tcPr>
+            <w:tcW w:w="3403" w:type="dxa"/>
+          </w:tcPr>
+          <w:p>
+            <w:pPr>
+              <w:rPr>
+                <w:rFonts w:ascii="Arial" w:hAnsi="Arial" w:cs="Arial"/>
+                <w:b/>
+                <w:bCs/>
+                <w:sz w:val="16"/>
+                <w:szCs w:val="16"/>
+              </w:rPr>
+            </w:pPr>
+            <w:r>
+              <w:rPr>
+                <w:rFonts w:ascii="Arial" w:hAnsi="Arial" w:cs="Arial"/>
+                <w:b/>
+                <w:bCs/>
+                <w:sz w:val="16"/>
+                <w:szCs w:val="16"/>
+              </w:rPr>
+              <w:t>[</w:t>
+            </w:r>
+            <w:proofErr w:type="spellStart"/>
+            <w:r>
+              <w:rPr>
+                <w:rFonts w:ascii="Arial" w:hAnsi="Arial" w:cs="Arial"/>
+                <w:b/>
+                <w:bCs/>
+                <w:sz w:val="16"/>
+                <w:szCs w:val="16"/>
+              </w:rPr>
+              <w:t>DesignName</w:t>
+            </w:r>
+            <w:proofErr w:type="spellEnd"/>
+            <w:r>
+              <w:rPr>
+                <w:rFonts w:ascii="Arial" w:hAnsi="Arial" w:cs="Arial"/>
+                <w:b/>
+                <w:bCs/>
+                <w:sz w:val="16"/>
+                <w:szCs w:val="16"/>
+              </w:rPr>
+              <w:t>]</w:t>
+            </w:r>
+          </w:p>
+        </w:tc>
+        <w:tc>
+          <w:tcPr>
+            <w:tcW w:w="379" w:type="dxa"/>
+          </w:tcPr>
+          <w:p>
+            <w:pPr>
+              <w:spacing w:before="100" w:after="100"/>
+              <w:jc w:val="center"/>
+              <w:rPr>
+                <w:rFonts w:ascii="Arial" w:hAnsi="Arial" w:cs="Arial"/>
+                <w:color w:val="000000"/>
+                <w:sz w:val="16"/>
+                <w:szCs w:val="24"/>
+              </w:rPr>
+            </w:pPr>
+            <w:r>
+              <w:rPr>
+                <w:rFonts w:ascii="Arial" w:hAnsi="Arial" w:cs="Arial"/>
+                <w:color w:val="000000"/>
+                <w:sz w:val="16"/>
+                <w:szCs w:val="24"/>
+              </w:rPr>
+              <w:t>S</w:t>
+            </w:r>
+          </w:p>
+        </w:tc>
+        <w:tc>
+          <w:tcPr>
+            <w:tcW w:w="6126" w:type="dxa"/>
+          </w:tcPr>
+          <w:p>
+            <w:pPr>
+              <w:spacing w:before="100" w:after="100"/>
+              <w:rPr>
+                <w:rFonts w:ascii="Arial" w:hAnsi="Arial" w:cs="Arial"/>
+                <w:color w:val="000000"/>
+                <w:sz w:val="16"/>
+                <w:szCs w:val="24"/>
+              </w:rPr>
+            </w:pPr>
+            <w:r>
+              <w:rPr>
+                <w:rFonts w:ascii="Arial" w:hAnsi="Arial" w:cs="Arial"/>
+                <w:color w:val="000000"/>
+                <w:sz w:val="16"/>
+                <w:szCs w:val="24"/>
+              </w:rPr>
+              <w:t>Signal used to show the current running design on the Q-SYS Core.</w:t>
+            </w:r>
+          </w:p>
+        </w:tc>
+      </w:tr>
+      <w:tr>
+        <w:trPr>
+          <w:cnfStyle w:val="000000100000" w:firstRow="0" w:lastRow="0" w:firstColumn="0" w:lastColumn="0" w:oddVBand="0" w:evenVBand="0" w:oddHBand="1" w:evenHBand="0" w:firstRowFirstColumn="0" w:firstRowLastColumn="0" w:lastRowFirstColumn="0" w:lastRowLastColumn="0"/>
         </w:trPr>
         <w:tc>
           <w:tcPr>
@@ -2836,6 +3061,170 @@
                 <w:szCs w:val="24"/>
               </w:rPr>
               <w:t>Used to Address Core Module to Control Modules</w:t>
+            </w:r>
+          </w:p>
+        </w:tc>
+      </w:tr>
+      <w:tr>
+        <w:trPr>
+          <w:cnfStyle w:val="000000100000" w:firstRow="0" w:lastRow="0" w:firstColumn="0" w:lastColumn="0" w:oddVBand="0" w:evenVBand="0" w:oddHBand="1" w:evenHBand="0" w:firstRowFirstColumn="0" w:firstRowLastColumn="0" w:lastRowFirstColumn="0" w:lastRowLastColumn="0"/>
+        </w:trPr>
+        <w:tc>
+          <w:tcPr>
+            <w:tcW w:w="3363" w:type="dxa"/>
+          </w:tcPr>
+          <w:p>
+            <w:pPr>
+              <w:rPr>
+                <w:rFonts w:ascii="Arial" w:hAnsi="Arial" w:cs="Arial"/>
+                <w:b/>
+                <w:bCs/>
+                <w:sz w:val="16"/>
+                <w:szCs w:val="16"/>
+              </w:rPr>
+            </w:pPr>
+            <w:r>
+              <w:rPr>
+                <w:rFonts w:ascii="Arial" w:hAnsi="Arial" w:cs="Arial"/>
+                <w:b/>
+                <w:bCs/>
+                <w:sz w:val="16"/>
+                <w:szCs w:val="16"/>
+              </w:rPr>
+              <w:t>Default Primary Core IP Address</w:t>
+            </w:r>
+          </w:p>
+        </w:tc>
+        <w:tc>
+          <w:tcPr>
+            <w:tcW w:w="501" w:type="dxa"/>
+          </w:tcPr>
+          <w:p>
+            <w:pPr>
+              <w:spacing w:before="100" w:after="100"/>
+              <w:jc w:val="center"/>
+              <w:rPr>
+                <w:rFonts w:ascii="Arial" w:hAnsi="Arial" w:cs="Arial"/>
+                <w:color w:val="000000"/>
+                <w:sz w:val="16"/>
+                <w:szCs w:val="24"/>
+              </w:rPr>
+            </w:pPr>
+            <w:r>
+              <w:rPr>
+                <w:rFonts w:ascii="Arial" w:hAnsi="Arial" w:cs="Arial"/>
+                <w:color w:val="000000"/>
+                <w:sz w:val="16"/>
+                <w:szCs w:val="24"/>
+              </w:rPr>
+              <w:t>S</w:t>
+            </w:r>
+          </w:p>
+        </w:tc>
+        <w:tc>
+          <w:tcPr>
+            <w:tcW w:w="6044" w:type="dxa"/>
+          </w:tcPr>
+          <w:p>
+            <w:pPr>
+              <w:spacing w:before="100" w:after="100"/>
+              <w:rPr>
+                <w:rFonts w:ascii="Arial" w:hAnsi="Arial" w:cs="Arial"/>
+                <w:color w:val="000000"/>
+                <w:sz w:val="16"/>
+                <w:szCs w:val="24"/>
+              </w:rPr>
+            </w:pPr>
+            <w:r>
+              <w:rPr>
+                <w:rFonts w:ascii="Arial" w:hAnsi="Arial" w:cs="Arial"/>
+                <w:color w:val="000000"/>
+                <w:sz w:val="16"/>
+                <w:szCs w:val="24"/>
+              </w:rPr>
+              <w:t>IP Address of your Primary Q-SYS Core</w:t>
+            </w:r>
+          </w:p>
+        </w:tc>
+      </w:tr>
+      <w:tr>
+        <w:trPr>
+          <w:cnfStyle w:val="000000010000" w:firstRow="0" w:lastRow="0" w:firstColumn="0" w:lastColumn="0" w:oddVBand="0" w:evenVBand="0" w:oddHBand="0" w:evenHBand="1" w:firstRowFirstColumn="0" w:firstRowLastColumn="0" w:lastRowFirstColumn="0" w:lastRowLastColumn="0"/>
+        </w:trPr>
+        <w:tc>
+          <w:tcPr>
+            <w:tcW w:w="3363" w:type="dxa"/>
+          </w:tcPr>
+          <w:p>
+            <w:pPr>
+              <w:rPr>
+                <w:rFonts w:ascii="Arial" w:hAnsi="Arial" w:cs="Arial"/>
+                <w:b/>
+                <w:bCs/>
+                <w:sz w:val="16"/>
+                <w:szCs w:val="16"/>
+              </w:rPr>
+            </w:pPr>
+            <w:r>
+              <w:rPr>
+                <w:rFonts w:ascii="Arial" w:hAnsi="Arial" w:cs="Arial"/>
+                <w:b/>
+                <w:bCs/>
+                <w:sz w:val="16"/>
+                <w:szCs w:val="16"/>
+              </w:rPr>
+              <w:t>Default Backup Core IP Address</w:t>
+            </w:r>
+          </w:p>
+        </w:tc>
+        <w:tc>
+          <w:tcPr>
+            <w:tcW w:w="501" w:type="dxa"/>
+          </w:tcPr>
+          <w:p>
+            <w:pPr>
+              <w:spacing w:before="100" w:after="100"/>
+              <w:jc w:val="center"/>
+              <w:rPr>
+                <w:rFonts w:ascii="Arial" w:hAnsi="Arial" w:cs="Arial"/>
+                <w:color w:val="000000"/>
+                <w:sz w:val="16"/>
+                <w:szCs w:val="24"/>
+              </w:rPr>
+            </w:pPr>
+            <w:r>
+              <w:rPr>
+                <w:rFonts w:ascii="Arial" w:hAnsi="Arial" w:cs="Arial"/>
+                <w:color w:val="000000"/>
+                <w:sz w:val="16"/>
+                <w:szCs w:val="24"/>
+              </w:rPr>
+              <w:t>S</w:t>
+            </w:r>
+          </w:p>
+        </w:tc>
+        <w:tc>
+          <w:tcPr>
+            <w:tcW w:w="6044" w:type="dxa"/>
+          </w:tcPr>
+          <w:p>
+            <w:pPr>
+              <w:spacing w:before="100" w:after="100"/>
+              <w:rPr>
+                <w:rFonts w:ascii="Arial" w:hAnsi="Arial" w:cs="Arial"/>
+                <w:color w:val="000000"/>
+                <w:sz w:val="16"/>
+                <w:szCs w:val="24"/>
+              </w:rPr>
+            </w:pPr>
+            <w:r>
+              <w:rPr>
+                <w:rFonts w:ascii="Arial" w:hAnsi="Arial" w:cs="Arial"/>
+                <w:color w:val="000000"/>
+                <w:sz w:val="16"/>
+                <w:szCs w:val="24"/>
+              </w:rPr>
+              <w:t>IP Address of your Backup Q-SYS Core</w:t>
             </w:r>
           </w:p>
         </w:tc>

</xml_diff>